<commit_message>
added a new file
</commit_message>
<xml_diff>
--- a/Smart tech Global.docx
+++ b/Smart tech Global.docx
@@ -11,6 +11,8 @@
           <w:szCs w:val="28"/>
         </w:rPr>
       </w:pPr>
+      <w:bookmarkStart w:id="0" w:name="_GoBack"/>
+      <w:bookmarkEnd w:id="0"/>
       <w:r>
         <w:rPr>
           <w:b/>
@@ -223,8 +225,6 @@
         </w:rPr>
         <w:t>:</w:t>
       </w:r>
-      <w:bookmarkStart w:id="0" w:name="_GoBack"/>
-      <w:bookmarkEnd w:id="0"/>
     </w:p>
     <w:p>
       <w:r>
@@ -245,13 +245,7 @@
         <w:t>(IDE</w:t>
       </w:r>
       <w:r>
-        <w:t>)</w:t>
-      </w:r>
-      <w:r>
-        <w:t>:</w:t>
-      </w:r>
-      <w:r>
-        <w:t xml:space="preserve"> is a software application that provides a comprehensive set of tools for software developers to write, edit, debug, build, test, and deploy code—all within a single unified interface.</w:t>
+        <w:t>): is a software application that provides a comprehensive set of tools for software developers to write, edit, debug, build, test, and deploy code—all within a single unified interface.</w:t>
       </w:r>
     </w:p>
     <w:p/>

</xml_diff>